<commit_message>
Removed motion sensor from LED Recommendation
</commit_message>
<xml_diff>
--- a/Lighting/LED/template 1.docx
+++ b/Lighting/LED/template 1.docx
@@ -427,19 +427,61 @@
         <w:rPr>
           <w:bCs/>
         </w:rPr>
-        <w:t xml:space="preserve">Replacing the old lights with new light emitting diode (LED) lights inside the plant will save energy. This </w:t>
-      </w:r>
+        <w:t xml:space="preserve">Replacing the old lights with new </w:t>
+      </w:r>
+      <w:proofErr w:type="gramStart"/>
       <w:r>
         <w:rPr>
           <w:bCs/>
         </w:rPr>
+        <w:t>light</w:t>
+      </w:r>
+      <w:proofErr w:type="gramEnd"/>
+      <w:r>
+        <w:rPr>
+          <w:bCs/>
+        </w:rPr>
+        <w:t xml:space="preserve"> emitting diode (LED) lights inside the plant will save energy. This </w:t>
+      </w:r>
+      <w:r>
+        <w:rPr>
+          <w:bCs/>
+        </w:rPr>
         <w:t>recommendation</w:t>
       </w:r>
       <w:r>
         <w:rPr>
           <w:bCs/>
         </w:rPr>
-        <w:t xml:space="preserve"> will indicate the additional savings realized by replacing all existing old lights with new, reliable, and highly-efficient LED technology lights.</w:t>
+        <w:t xml:space="preserve"> will indicate the additional savings </w:t>
+      </w:r>
+      <w:proofErr w:type="gramStart"/>
+      <w:r>
+        <w:rPr>
+          <w:bCs/>
+        </w:rPr>
+        <w:t>realized</w:t>
+      </w:r>
+      <w:proofErr w:type="gramEnd"/>
+      <w:r>
+        <w:rPr>
+          <w:bCs/>
+        </w:rPr>
+        <w:t xml:space="preserve"> by replacing all existing old lights with new, reliable, and </w:t>
+      </w:r>
+      <w:proofErr w:type="gramStart"/>
+      <w:r>
+        <w:rPr>
+          <w:bCs/>
+        </w:rPr>
+        <w:t>highly-efficient</w:t>
+      </w:r>
+      <w:proofErr w:type="gramEnd"/>
+      <w:r>
+        <w:rPr>
+          <w:bCs/>
+        </w:rPr>
+        <w:t xml:space="preserve"> LED technology lights.</w:t>
       </w:r>
     </w:p>
     <w:p>
@@ -457,7 +499,15 @@
         <w:t>lights</w:t>
       </w:r>
       <w:r>
-        <w:t xml:space="preserve"> that have a longer rated life, require less wattage for use, and do not use toxic chemicals, such as </w:t>
+        <w:t xml:space="preserve"> that have a longer rated life, require less </w:t>
+      </w:r>
+      <w:proofErr w:type="gramStart"/>
+      <w:r>
+        <w:t>wattage</w:t>
+      </w:r>
+      <w:proofErr w:type="gramEnd"/>
+      <w:r>
+        <w:t xml:space="preserve"> for use, and do not use toxic chemicals, such as </w:t>
       </w:r>
       <w:r>
         <w:t>${PREV1}</w:t>
@@ -507,7 +557,15 @@
         <w:tab/>
       </w:r>
       <w:r>
-        <w:t xml:space="preserve">LED technology is currently the primary focus of research and manufacturing for lighting companies, such as General Electric and Phillips. This research and development is leading to LED lighting products that are more efficient converting electrical energy to light, </w:t>
+        <w:t xml:space="preserve">LED technology is currently the primary focus of research and manufacturing for lighting companies, such as General Electric and Phillips. This research and development </w:t>
+      </w:r>
+      <w:proofErr w:type="gramStart"/>
+      <w:r>
+        <w:t>is</w:t>
+      </w:r>
+      <w:proofErr w:type="gramEnd"/>
+      <w:r>
+        <w:t xml:space="preserve"> leading to LED lighting products that are more efficient converting electrical energy to light, </w:t>
       </w:r>
       <w:r>
         <w:lastRenderedPageBreak/>
@@ -544,7 +602,7 @@
           <w:noProof/>
         </w:rPr>
         <w:drawing>
-          <wp:inline distT="0" distB="0" distL="0" distR="0" wp14:anchorId="1802F413" wp14:editId="692DC24E">
+          <wp:inline distT="0" distB="0" distL="0" distR="0" wp14:anchorId="1802F413" wp14:editId="39424600">
             <wp:extent cx="4895466" cy="3657600"/>
             <wp:effectExtent l="0" t="0" r="635" b="0"/>
             <wp:docPr id="8" name="Picture 8" descr="Chart&#10;&#10;Description automatically generated"/>
@@ -687,7 +745,15 @@
         <w:tab/>
       </w:r>
       <w:r>
-        <w:t>Color improvements with a blue-white light and improved uniformity cause the overall visibility to improve through LED bulbs, even though as much as 43% less foot-candles may be present. All these advantages make indoor LED lighting solutions ideal for the plant area applications requested by your plant.</w:t>
+        <w:t xml:space="preserve">Color improvements with a blue-white light and improved uniformity cause the overall visibility to improve through LED bulbs, even though as much as 43% less foot-candles may be present. All these advantages make indoor LED </w:t>
+      </w:r>
+      <w:proofErr w:type="gramStart"/>
+      <w:r>
+        <w:t>lighting solutions</w:t>
+      </w:r>
+      <w:proofErr w:type="gramEnd"/>
+      <w:r>
+        <w:t xml:space="preserve"> ideal for the plant area applications requested by your plant.</w:t>
       </w:r>
     </w:p>
     <w:sectPr>
@@ -747,8 +813,13 @@
         <w:footnoteRef/>
       </w:r>
       <w:r>
-        <w:t xml:space="preserve"> Lumen Maintenance and Light Loss Factors: Consequences of Current Design Practices for LEDs, Pacific Northwest National  Laboratory</w:t>
-      </w:r>
+        <w:t xml:space="preserve"> Lumen Maintenance and Light Loss Factors: Consequences of Current Design Practices for LEDs, Pacific Northwest </w:t>
+      </w:r>
+      <w:proofErr w:type="gramStart"/>
+      <w:r>
+        <w:t>National  Laboratory</w:t>
+      </w:r>
+      <w:proofErr w:type="gramEnd"/>
     </w:p>
   </w:footnote>
 </w:footnotes>

</xml_diff>

<commit_message>
Removed all instances of motion sensors, updated OH to be one value, updated implementation cost to be IC not MIC
</commit_message>
<xml_diff>
--- a/Lighting/LED/template 1.docx
+++ b/Lighting/LED/template 1.docx
@@ -236,7 +236,7 @@
               <w:spacing w:before="60" w:after="60"/>
             </w:pPr>
             <w:r>
-              <w:t>${MIC}</w:t>
+              <w:t>${IC}</w:t>
             </w:r>
           </w:p>
         </w:tc>
@@ -269,13 +269,7 @@
               <w:spacing w:before="60" w:after="60"/>
             </w:pPr>
             <w:r>
-              <w:t>${</w:t>
-            </w:r>
-            <w:r>
-              <w:t>M</w:t>
-            </w:r>
-            <w:r>
-              <w:t>P</w:t>
+              <w:t>${P</w:t>
             </w:r>
             <w:r>
               <w:t>B</w:t>
@@ -427,61 +421,19 @@
         <w:rPr>
           <w:bCs/>
         </w:rPr>
-        <w:t xml:space="preserve">Replacing the old lights with new </w:t>
-      </w:r>
-      <w:proofErr w:type="gramStart"/>
+        <w:t xml:space="preserve">Replacing the old lights with new light emitting diode (LED) lights inside the plant will save energy. This </w:t>
+      </w:r>
       <w:r>
         <w:rPr>
           <w:bCs/>
         </w:rPr>
-        <w:t>light</w:t>
-      </w:r>
-      <w:proofErr w:type="gramEnd"/>
+        <w:t>recommendation</w:t>
+      </w:r>
       <w:r>
         <w:rPr>
           <w:bCs/>
         </w:rPr>
-        <w:t xml:space="preserve"> emitting diode (LED) lights inside the plant will save energy. This </w:t>
-      </w:r>
-      <w:r>
-        <w:rPr>
-          <w:bCs/>
-        </w:rPr>
-        <w:t>recommendation</w:t>
-      </w:r>
-      <w:r>
-        <w:rPr>
-          <w:bCs/>
-        </w:rPr>
-        <w:t xml:space="preserve"> will indicate the additional savings </w:t>
-      </w:r>
-      <w:proofErr w:type="gramStart"/>
-      <w:r>
-        <w:rPr>
-          <w:bCs/>
-        </w:rPr>
-        <w:t>realized</w:t>
-      </w:r>
-      <w:proofErr w:type="gramEnd"/>
-      <w:r>
-        <w:rPr>
-          <w:bCs/>
-        </w:rPr>
-        <w:t xml:space="preserve"> by replacing all existing old lights with new, reliable, and </w:t>
-      </w:r>
-      <w:proofErr w:type="gramStart"/>
-      <w:r>
-        <w:rPr>
-          <w:bCs/>
-        </w:rPr>
-        <w:t>highly-efficient</w:t>
-      </w:r>
-      <w:proofErr w:type="gramEnd"/>
-      <w:r>
-        <w:rPr>
-          <w:bCs/>
-        </w:rPr>
-        <w:t xml:space="preserve"> LED technology lights.</w:t>
+        <w:t xml:space="preserve"> will indicate the additional savings realized by replacing all existing old lights with new, reliable, and highly-efficient LED technology lights.</w:t>
       </w:r>
     </w:p>
     <w:p>
@@ -499,15 +451,7 @@
         <w:t>lights</w:t>
       </w:r>
       <w:r>
-        <w:t xml:space="preserve"> that have a longer rated life, require less </w:t>
-      </w:r>
-      <w:proofErr w:type="gramStart"/>
-      <w:r>
-        <w:t>wattage</w:t>
-      </w:r>
-      <w:proofErr w:type="gramEnd"/>
-      <w:r>
-        <w:t xml:space="preserve"> for use, and do not use toxic chemicals, such as </w:t>
+        <w:t xml:space="preserve"> that have a longer rated life, require less wattage for use, and do not use toxic chemicals, such as </w:t>
       </w:r>
       <w:r>
         <w:t>${PREV1}</w:t>
@@ -557,15 +501,7 @@
         <w:tab/>
       </w:r>
       <w:r>
-        <w:t xml:space="preserve">LED technology is currently the primary focus of research and manufacturing for lighting companies, such as General Electric and Phillips. This research and development </w:t>
-      </w:r>
-      <w:proofErr w:type="gramStart"/>
-      <w:r>
-        <w:t>is</w:t>
-      </w:r>
-      <w:proofErr w:type="gramEnd"/>
-      <w:r>
-        <w:t xml:space="preserve"> leading to LED lighting products that are more efficient converting electrical energy to light, </w:t>
+        <w:t xml:space="preserve">LED technology is currently the primary focus of research and manufacturing for lighting companies, such as General Electric and Phillips. This research and development is leading to LED lighting products that are more efficient converting electrical energy to light, </w:t>
       </w:r>
       <w:r>
         <w:lastRenderedPageBreak/>
@@ -602,7 +538,7 @@
           <w:noProof/>
         </w:rPr>
         <w:drawing>
-          <wp:inline distT="0" distB="0" distL="0" distR="0" wp14:anchorId="1802F413" wp14:editId="39424600">
+          <wp:inline distT="0" distB="0" distL="0" distR="0" wp14:anchorId="1802F413" wp14:editId="09D930D7">
             <wp:extent cx="4895466" cy="3657600"/>
             <wp:effectExtent l="0" t="0" r="635" b="0"/>
             <wp:docPr id="8" name="Picture 8" descr="Chart&#10;&#10;Description automatically generated"/>
@@ -745,15 +681,7 @@
         <w:tab/>
       </w:r>
       <w:r>
-        <w:t xml:space="preserve">Color improvements with a blue-white light and improved uniformity cause the overall visibility to improve through LED bulbs, even though as much as 43% less foot-candles may be present. All these advantages make indoor LED </w:t>
-      </w:r>
-      <w:proofErr w:type="gramStart"/>
-      <w:r>
-        <w:t>lighting solutions</w:t>
-      </w:r>
-      <w:proofErr w:type="gramEnd"/>
-      <w:r>
-        <w:t xml:space="preserve"> ideal for the plant area applications requested by your plant.</w:t>
+        <w:t>Color improvements with a blue-white light and improved uniformity cause the overall visibility to improve through LED bulbs, even though as much as 43% less foot-candles may be present. All these advantages make indoor LED lighting solutions ideal for the plant area applications requested by your plant.</w:t>
       </w:r>
     </w:p>
     <w:sectPr>
@@ -813,13 +741,8 @@
         <w:footnoteRef/>
       </w:r>
       <w:r>
-        <w:t xml:space="preserve"> Lumen Maintenance and Light Loss Factors: Consequences of Current Design Practices for LEDs, Pacific Northwest </w:t>
-      </w:r>
-      <w:proofErr w:type="gramStart"/>
-      <w:r>
-        <w:t>National  Laboratory</w:t>
-      </w:r>
-      <w:proofErr w:type="gramEnd"/>
+        <w:t xml:space="preserve"> Lumen Maintenance and Light Loss Factors: Consequences of Current Design Practices for LEDs, Pacific Northwest National  Laboratory</w:t>
+      </w:r>
     </w:p>
   </w:footnote>
 </w:footnotes>
@@ -1970,28 +1893,28 @@
 </file>
 
 <file path=customXml/item1.xml><?xml version="1.0" encoding="utf-8"?>
+<b:Sources xmlns:b="http://schemas.openxmlformats.org/officeDocument/2006/bibliography" xmlns="http://schemas.openxmlformats.org/officeDocument/2006/bibliography" SelectedStyle="/APASixthEditionOfficeOnline.xsl" StyleName="APA" Version="6"/>
+</file>
+
+<file path=customXml/item2.xml><?xml version="1.0" encoding="utf-8"?>
 <go:gDocsCustomXmlDataStorage xmlns:go="http://customooxmlschemas.google.com/" xmlns:r="http://schemas.openxmlformats.org/officeDocument/2006/relationships">
   <go:docsCustomData xmlns:go="http://customooxmlschemas.google.com/" roundtripDataSignature="AMtx7mge1g7Rp+86f12lCP2Ro2HGid8roA==">AMUW2mWHn+E7WS7kPXZiReHbbko8kjkzJUPaDx7Nv4KzQeHlqeFDmYBR0EHOczslKIMzne16FXCp94dEpjYENbzkNwX703MQsXn1vkFHaZiLxJEFlSBsXYM6qNQ8xd9t3jt50InLEDXwCpqAL0L2VIn1rn9jpzUdBMMABydKOHmAQAo4IZFbTrc0GOIfgZ1kGH+KW5sg3i8rbKXGqRuUPKYAs+XG+JPzug==</go:docsCustomData>
 </go:gDocsCustomXmlDataStorage>
 </file>
 
-<file path=customXml/item2.xml><?xml version="1.0" encoding="utf-8"?>
-<b:Sources xmlns:b="http://schemas.openxmlformats.org/officeDocument/2006/bibliography" xmlns="http://schemas.openxmlformats.org/officeDocument/2006/bibliography" SelectedStyle="/APASixthEditionOfficeOnline.xsl" StyleName="APA" Version="6"/>
+<file path=customXml/itemProps1.xml><?xml version="1.0" encoding="utf-8"?>
+<ds:datastoreItem xmlns:ds="http://schemas.openxmlformats.org/officeDocument/2006/customXml" ds:itemID="{E8E232B9-1A23-964A-AD2D-383C2D10B008}">
+  <ds:schemaRefs>
+    <ds:schemaRef ds:uri="http://schemas.openxmlformats.org/officeDocument/2006/bibliography"/>
+  </ds:schemaRefs>
+</ds:datastoreItem>
 </file>
 
-<file path=customXml/itemProps1.xml><?xml version="1.0" encoding="utf-8"?>
+<file path=customXml/itemProps2.xml><?xml version="1.0" encoding="utf-8"?>
 <ds:datastoreItem xmlns:ds="http://schemas.openxmlformats.org/officeDocument/2006/customXml" ds:itemID="{11111111-1234-1234-1234-123412341234}">
   <ds:schemaRefs>
     <ds:schemaRef ds:uri="http://customooxmlschemas.google.com/"/>
     <ds:schemaRef ds:uri="http://schemas.openxmlformats.org/officeDocument/2006/relationships"/>
   </ds:schemaRefs>
 </ds:datastoreItem>
-</file>
-
-<file path=customXml/itemProps2.xml><?xml version="1.0" encoding="utf-8"?>
-<ds:datastoreItem xmlns:ds="http://schemas.openxmlformats.org/officeDocument/2006/customXml" ds:itemID="{E8E232B9-1A23-964A-AD2D-383C2D10B008}">
-  <ds:schemaRefs>
-    <ds:schemaRef ds:uri="http://schemas.openxmlformats.org/officeDocument/2006/bibliography"/>
-  </ds:schemaRefs>
-</ds:datastoreItem>
 </file>
</xml_diff>